<commit_message>
feat(session): page Metadata Session true | false | empty + Redirect To
Everything is decided in the page Metadata (guardPage, before painting and
again whenever the session changes):
  Session true  → only with a session; without one → Redirect To
  Session false → only without a session (login); with one → Redirect To
  no row/empty  → public, nothing checked
Redirect To missing or empty → home (/). Nothing is added to the URL.
The login block no longer redirects (Redirect With Session row removed): it
signs in and hides itself; on the login page (Session false) a guest still
sees it. New requireNoSession() and getPageSessionRule().
login.docx (Session false, Redirect To /cuenta), new cuenta.docx (Session
true, Redirect To /login), perfil.docx with Redirect To; docs updated.

Co-Authored-By: Claude Opus 5.5 (1M context) <noreply@anthropic.com>
</commit_message>
<xml_diff>
--- a/content-drive/cuenta.docx
+++ b/content-drive/cuenta.docx
@@ -1,6 +1,6 @@
 
 <file path=word/document.xml><?xml version="1.0" encoding="utf-8"?>
-<w:document xmlns:w="http://schemas.openxmlformats.org/wordprocessingml/2006/main" xmlns:r="http://schemas.openxmlformats.org/officeDocument/2006/relationships">
+<w:document xmlns:w="http://schemas.openxmlformats.org/wordprocessingml/2006/main" xmlns:r="http://schemas.openxmlformats.org/officeDocument/2006/relationships" xmlns:wp="http://schemas.openxmlformats.org/drawingml/2006/wordprocessingDrawing" xmlns:a="http://schemas.openxmlformats.org/drawingml/2006/main" xmlns:pic="http://schemas.openxmlformats.org/drawingml/2006/picture">
   <w:body>
     <w:p>
       <w:pPr>
@@ -17,7 +17,8 @@
     </w:p>
     <w:tbl>
       <w:tblPr>
-        <w:tblW w:w="0" w:type="auto"/>
+        <w:tblW w:w="9360" w:type="dxa"/>
+        <w:tblLayout w:type="fixed"/>
         <w:tblBorders>
           <w:top w:val="single" w:sz="4" w:color="999999"/>
           <w:left w:val="single" w:sz="4" w:color="999999"/>
@@ -28,12 +29,13 @@
         </w:tblBorders>
       </w:tblPr>
       <w:tblGrid>
-        <w:gridCol w:w="4500"/>
-        <w:gridCol w:w="4500"/>
+        <w:gridCol w:w="2160"/>
+        <w:gridCol w:w="7200"/>
       </w:tblGrid>
       <w:tr>
         <w:tc>
           <w:tcPr>
+            <w:tcW w:w="9360" w:type="dxa"/>
             <w:gridSpan w:val="2"/>
           </w:tcPr>
           <w:p>
@@ -45,6 +47,9 @@
       </w:tr>
       <w:tr>
         <w:tc>
+          <w:tcPr>
+            <w:tcW w:w="2160" w:type="dxa"/>
+          </w:tcPr>
           <w:p>
             <w:r>
               <w:t xml:space="preserve">Title</w:t>
@@ -52,6 +57,9 @@
           </w:p>
         </w:tc>
         <w:tc>
+          <w:tcPr>
+            <w:tcW w:w="7200" w:type="dxa"/>
+          </w:tcPr>
           <w:p>
             <w:r>
               <w:t xml:space="preserve">Mi cuenta | NovaMóvil</w:t>
@@ -61,6 +69,9 @@
       </w:tr>
       <w:tr>
         <w:tc>
+          <w:tcPr>
+            <w:tcW w:w="2160" w:type="dxa"/>
+          </w:tcPr>
           <w:p>
             <w:r>
               <w:t xml:space="preserve">Description</w:t>
@@ -68,22 +79,72 @@
           </w:p>
         </w:tc>
         <w:tc>
+          <w:tcPr>
+            <w:tcW w:w="7200" w:type="dxa"/>
+          </w:tcPr>
           <w:p>
             <w:r>
               <w:t xml:space="preserve">Consulta tus pedidos, datos personales y métodos de pago.</w:t>
+            </w:r>
+          </w:p>
+        </w:tc>
+      </w:tr>
+      <w:tr>
+        <w:tc>
+          <w:tcPr>
+            <w:tcW w:w="2160" w:type="dxa"/>
+          </w:tcPr>
+          <w:p>
+            <w:r>
+              <w:t xml:space="preserve">Session</w:t>
+            </w:r>
+          </w:p>
+        </w:tc>
+        <w:tc>
+          <w:tcPr>
+            <w:tcW w:w="7200" w:type="dxa"/>
+          </w:tcPr>
+          <w:p>
+            <w:r>
+              <w:t xml:space="preserve">true</w:t>
+            </w:r>
+          </w:p>
+        </w:tc>
+      </w:tr>
+      <w:tr>
+        <w:tc>
+          <w:tcPr>
+            <w:tcW w:w="2160" w:type="dxa"/>
+          </w:tcPr>
+          <w:p>
+            <w:r>
+              <w:t xml:space="preserve">Redirect To</w:t>
+            </w:r>
+          </w:p>
+        </w:tc>
+        <w:tc>
+          <w:tcPr>
+            <w:tcW w:w="7200" w:type="dxa"/>
+          </w:tcPr>
+          <w:p>
+            <w:r>
+              <w:t xml:space="preserve">/login</w:t>
             </w:r>
           </w:p>
         </w:tc>
       </w:tr>
     </w:tbl>
     <w:p/>
-    <w:sectPr/>
+    <w:sectPr>
+      <w:pgSz w:w="12240" w:h="15840"/>
+      <w:pgMar w:top="1440" w:right="1440" w:bottom="1440" w:left="1440" w:header="720" w:footer="720" w:gutter="0"/>
+    </w:sectPr>
   </w:body>
 </w:document>
 </file>
 
 <file path=word/numbering.xml><?xml version="1.0" encoding="utf-8"?>
-<w:numbering xmlns:w="http://schemas.openxmlformats.org/wordprocessingml/2006/main" xmlns:r="http://schemas.openxmlformats.org/officeDocument/2006/relationships">
+<w:numbering xmlns:w="http://schemas.openxmlformats.org/wordprocessingml/2006/main" xmlns:r="http://schemas.openxmlformats.org/officeDocument/2006/relationships" xmlns:wp="http://schemas.openxmlformats.org/drawingml/2006/wordprocessingDrawing" xmlns:a="http://schemas.openxmlformats.org/drawingml/2006/main" xmlns:pic="http://schemas.openxmlformats.org/drawingml/2006/picture">
   <w:abstractNum w:abstractNumId="0">
     <w:lvl w:ilvl="0">
       <w:start w:val="1"/>
@@ -126,7 +187,7 @@
 </file>
 
 <file path=word/styles.xml><?xml version="1.0" encoding="utf-8"?>
-<w:styles xmlns:w="http://schemas.openxmlformats.org/wordprocessingml/2006/main" xmlns:r="http://schemas.openxmlformats.org/officeDocument/2006/relationships">
+<w:styles xmlns:w="http://schemas.openxmlformats.org/wordprocessingml/2006/main" xmlns:r="http://schemas.openxmlformats.org/officeDocument/2006/relationships" xmlns:wp="http://schemas.openxmlformats.org/drawingml/2006/wordprocessingDrawing" xmlns:a="http://schemas.openxmlformats.org/drawingml/2006/main" xmlns:pic="http://schemas.openxmlformats.org/drawingml/2006/picture">
   <w:style w:type="paragraph" w:default="1" w:styleId="Normal">
     <w:name w:val="Normal"/>
     <w:qFormat/>

</xml_diff>

<commit_message>
feat(account-profile): Mi cuenta block with the user of the session
- blocks/account-profile: reads the session with one getSessionData() call (user + fields),
  paints the fields that have a label row, verified badge and sign out (logoutUser)
- colors --account-profile-*, grid columns inline, README with the step by step of how the
  data is read, previews and Drive table image
- content-drive/cuenta.docx with the Account Profile table
- block linked in foundations README, guides 06 and 08, universalMigration and block-options

Co-Authored-By: Claude Opus 5.5 (1M context) <noreply@anthropic.com>
</commit_message>
<xml_diff>
--- a/content-drive/cuenta.docx
+++ b/content-drive/cuenta.docx
@@ -15,6 +15,250 @@
         <w:t xml:space="preserve">Consulta tus pedidos, datos personales y métodos de pago.</w:t>
       </w:r>
     </w:p>
+    <w:tbl>
+      <w:tblPr>
+        <w:tblW w:w="9360" w:type="dxa"/>
+        <w:tblLayout w:type="fixed"/>
+        <w:tblBorders>
+          <w:top w:val="single" w:sz="4" w:color="999999"/>
+          <w:left w:val="single" w:sz="4" w:color="999999"/>
+          <w:bottom w:val="single" w:sz="4" w:color="999999"/>
+          <w:right w:val="single" w:sz="4" w:color="999999"/>
+          <w:insideH w:val="single" w:sz="4" w:color="999999"/>
+          <w:insideV w:val="single" w:sz="4" w:color="999999"/>
+        </w:tblBorders>
+      </w:tblPr>
+      <w:tblGrid>
+        <w:gridCol w:w="2160"/>
+        <w:gridCol w:w="7200"/>
+      </w:tblGrid>
+      <w:tr>
+        <w:tc>
+          <w:tcPr>
+            <w:tcW w:w="9360" w:type="dxa"/>
+            <w:gridSpan w:val="2"/>
+          </w:tcPr>
+          <w:p>
+            <w:r>
+              <w:t xml:space="preserve">Account Profile</w:t>
+            </w:r>
+          </w:p>
+        </w:tc>
+      </w:tr>
+      <w:tr>
+        <w:tc>
+          <w:tcPr>
+            <w:tcW w:w="2160" w:type="dxa"/>
+          </w:tcPr>
+          <w:p>
+            <w:r>
+              <w:t xml:space="preserve">Styles</w:t>
+            </w:r>
+          </w:p>
+        </w:tc>
+        <w:tc>
+          <w:tcPr>
+            <w:tcW w:w="7200" w:type="dxa"/>
+          </w:tcPr>
+          <w:p/>
+        </w:tc>
+      </w:tr>
+      <w:tr>
+        <w:tc>
+          <w:tcPr>
+            <w:tcW w:w="2160" w:type="dxa"/>
+          </w:tcPr>
+          <w:p>
+            <w:r>
+              <w:t xml:space="preserve">Classname</w:t>
+            </w:r>
+          </w:p>
+        </w:tc>
+        <w:tc>
+          <w:tcPr>
+            <w:tcW w:w="7200" w:type="dxa"/>
+          </w:tcPr>
+          <w:p/>
+        </w:tc>
+      </w:tr>
+      <w:tr>
+        <w:tc>
+          <w:tcPr>
+            <w:tcW w:w="2160" w:type="dxa"/>
+          </w:tcPr>
+          <w:p>
+            <w:r>
+              <w:t xml:space="preserve">Title</w:t>
+            </w:r>
+          </w:p>
+        </w:tc>
+        <w:tc>
+          <w:tcPr>
+            <w:tcW w:w="7200" w:type="dxa"/>
+          </w:tcPr>
+          <w:p>
+            <w:r>
+              <w:t xml:space="preserve">Tus datos</w:t>
+            </w:r>
+          </w:p>
+        </w:tc>
+      </w:tr>
+      <w:tr>
+        <w:tc>
+          <w:tcPr>
+            <w:tcW w:w="2160" w:type="dxa"/>
+          </w:tcPr>
+          <w:p>
+            <w:r>
+              <w:t xml:space="preserve">Name Label</w:t>
+            </w:r>
+          </w:p>
+        </w:tc>
+        <w:tc>
+          <w:tcPr>
+            <w:tcW w:w="7200" w:type="dxa"/>
+          </w:tcPr>
+          <w:p>
+            <w:r>
+              <w:t xml:space="preserve">Nombre</w:t>
+            </w:r>
+          </w:p>
+        </w:tc>
+      </w:tr>
+      <w:tr>
+        <w:tc>
+          <w:tcPr>
+            <w:tcW w:w="2160" w:type="dxa"/>
+          </w:tcPr>
+          <w:p>
+            <w:r>
+              <w:t xml:space="preserve">Email Label</w:t>
+            </w:r>
+          </w:p>
+        </w:tc>
+        <w:tc>
+          <w:tcPr>
+            <w:tcW w:w="7200" w:type="dxa"/>
+          </w:tcPr>
+          <w:p>
+            <w:r>
+              <w:t xml:space="preserve">Correo electrónico</w:t>
+            </w:r>
+          </w:p>
+        </w:tc>
+      </w:tr>
+      <w:tr>
+        <w:tc>
+          <w:tcPr>
+            <w:tcW w:w="2160" w:type="dxa"/>
+          </w:tcPr>
+          <w:p>
+            <w:r>
+              <w:t xml:space="preserve">Phone Label</w:t>
+            </w:r>
+          </w:p>
+        </w:tc>
+        <w:tc>
+          <w:tcPr>
+            <w:tcW w:w="7200" w:type="dxa"/>
+          </w:tcPr>
+          <w:p>
+            <w:r>
+              <w:t xml:space="preserve">Teléfono</w:t>
+            </w:r>
+          </w:p>
+        </w:tc>
+      </w:tr>
+      <w:tr>
+        <w:tc>
+          <w:tcPr>
+            <w:tcW w:w="2160" w:type="dxa"/>
+          </w:tcPr>
+          <w:p>
+            <w:r>
+              <w:t xml:space="preserve">User Id Label</w:t>
+            </w:r>
+          </w:p>
+        </w:tc>
+        <w:tc>
+          <w:tcPr>
+            <w:tcW w:w="7200" w:type="dxa"/>
+          </w:tcPr>
+          <w:p>
+            <w:r>
+              <w:t xml:space="preserve">Número de cliente</w:t>
+            </w:r>
+          </w:p>
+        </w:tc>
+      </w:tr>
+      <w:tr>
+        <w:tc>
+          <w:tcPr>
+            <w:tcW w:w="2160" w:type="dxa"/>
+          </w:tcPr>
+          <w:p>
+            <w:r>
+              <w:t xml:space="preserve">Verified Text</w:t>
+            </w:r>
+          </w:p>
+        </w:tc>
+        <w:tc>
+          <w:tcPr>
+            <w:tcW w:w="7200" w:type="dxa"/>
+          </w:tcPr>
+          <w:p>
+            <w:r>
+              <w:t xml:space="preserve">Cuenta verificada</w:t>
+            </w:r>
+          </w:p>
+        </w:tc>
+      </w:tr>
+      <w:tr>
+        <w:tc>
+          <w:tcPr>
+            <w:tcW w:w="2160" w:type="dxa"/>
+          </w:tcPr>
+          <w:p>
+            <w:r>
+              <w:t xml:space="preserve">Sign Out Text</w:t>
+            </w:r>
+          </w:p>
+        </w:tc>
+        <w:tc>
+          <w:tcPr>
+            <w:tcW w:w="7200" w:type="dxa"/>
+          </w:tcPr>
+          <w:p>
+            <w:r>
+              <w:t xml:space="preserve">Cerrar sesión</w:t>
+            </w:r>
+          </w:p>
+        </w:tc>
+      </w:tr>
+      <w:tr>
+        <w:tc>
+          <w:tcPr>
+            <w:tcW w:w="2160" w:type="dxa"/>
+          </w:tcPr>
+          <w:p>
+            <w:r>
+              <w:t xml:space="preserve">Empty Text</w:t>
+            </w:r>
+          </w:p>
+        </w:tc>
+        <w:tc>
+          <w:tcPr>
+            <w:tcW w:w="7200" w:type="dxa"/>
+          </w:tcPr>
+          <w:p>
+            <w:r>
+              <w:t xml:space="preserve">Inicia sesión para ver los datos de tu cuenta.</w:t>
+            </w:r>
+          </w:p>
+        </w:tc>
+      </w:tr>
+    </w:tbl>
+    <w:p/>
     <w:tbl>
       <w:tblPr>
         <w:tblW w:w="9360" w:type="dxa"/>

</xml_diff>